<commit_message>
Cycle count: submit per category
</commit_message>
<xml_diff>
--- a/MedSync_Executive_Summary_v23.docx
+++ b/MedSync_Executive_Summary_v23.docx
@@ -49,7 +49,7 @@
               </w:rPr>
               <w:drawing>
                 <wp:inline xmlns:wp="http://schemas.openxmlformats.org/drawingml/2006/wordprocessingDrawing" distT="0" distB="0" distL="0" distR="0">
-                  <wp:extent cx="4572000" cy="2078181"/>
+                  <wp:extent cx="3200400" cy="2130113"/>
                   <wp:effectExtent t="0" r="0" b="0" l="0"/>
                   <wp:docPr id="100" name="MedSync Logo" descr="MedSync split capsule mark with veterinary caduceus"/>
                   <wp:cNvGraphicFramePr>
@@ -73,7 +73,7 @@
                         <pic:spPr>
                           <a:xfrm>
                             <a:off x="0" y="0"/>
-                            <a:ext cx="4572000" cy="2078181"/>
+                            <a:ext cx="3200400" cy="2130113"/>
                           </a:xfrm>
                           <a:prstGeom prst="rect">
                             <a:avLst/>
@@ -94,7 +94,7 @@
             <w:r>
               <w:rPr>
                 <w:rFonts w:ascii="Arial" w:cs="Arial" w:eastAsia="Arial" w:hAnsi="Arial"/>
-                <w:color w:val="F5EDD8"/>
+                <w:color w:val="FFFFFF"/>
                 <w:sz w:val="56"/>
                 <w:szCs w:val="56"/>
               </w:rPr>
@@ -145,7 +145,7 @@
                 <w:rFonts w:ascii="Georgia" w:cs="Georgia" w:eastAsia="Georgia" w:hAnsi="Georgia"/>
                 <w:i/>
                 <w:iCs/>
-                <w:color w:val="F5EDD8"/>
+                <w:color w:val="FFFFFF"/>
                 <w:sz w:val="36"/>
                 <w:szCs w:val="36"/>
               </w:rPr>
@@ -164,7 +164,7 @@
                 <w:sz w:val="26"/>
                 <w:szCs w:val="26"/>
               </w:rPr>
-              <w:t xml:space="preserve">MedSync is a cloud-based veterinary inventory intelligence platform built from the inside out — conceived, designed, and prototyped by the Admin who built Scout’s entire inventory methodology from scratch. This document is a proposal to fund the production-grade development of that platform — building on a working prototype already live at medsync.vet with active Vetspire API integration running on Scout’s data — deploy it fully across Scout’s locations in 2028, and bring it to the external veterinary market in 2029 as the founding product of a Thurlow Technology Division. The opportunity: a $24M ARR addressable market with no direct competitor combining demand forecasting, multi-location intelligence, and integrated procurement. The ask: $650,000–$850,000 in seed investment. The return: equity in a platform that Scout already proved works, led by the CEO of the organization that built it, validated on live clinical data before a single external dollar is spent.</w:t>
+              <w:t xml:space="preserve">MedSync is a cloud-based veterinary inventory intelligence platform built from the inside out — conceived, designed, and prototyped by the Admin who built Scout’s entire inventory methodology from scratch. This document is a proposal to deploy that platform at Scout this quarter. The product is built. Vetspire is integrated and running on Scout’s live data tonight. This is not a fund-the-build pitch. This is a deploy-now pitch — four Scout hospitals live on MedSync by Q4 2026, twelve months of documented ROI in hand by end of 2027, and an external market launch in 2028 backed by something no competitor will ever have: proof it works on Thurlow’s own hospitals. The opportunity: a $24M ARR addressable market. The ask: $400,000–$550,000. The return: equity in a platform that already works, deployed on Scout’s live data tonight, generating ROI before a single external customer is approached.</w:t>
             </w:r>
           </w:p>
           <w:p>
@@ -185,7 +185,7 @@
                 <w:rFonts w:ascii="Arial" w:cs="Arial" w:eastAsia="Arial" w:hAnsi="Arial"/>
                 <w:b/>
                 <w:bCs/>
-                <w:color w:val="F5EDD8"/>
+                <w:color w:val="FFFFFF"/>
                 <w:sz w:val="16"/>
                 <w:szCs w:val="16"/>
               </w:rPr>
@@ -490,10 +490,10 @@
           <w:tcPr>
             <w:tcW w:type="dxa" w:w="10800"/>
             <w:tcBorders>
-              <w:top w:val="single" w:color="8899AA" w:sz="1"/>
-              <w:left w:val="single" w:color="8899AA" w:sz="1"/>
-              <w:bottom w:val="single" w:color="8899AA" w:sz="1"/>
-              <w:right w:val="single" w:color="8899AA" w:sz="1"/>
+              <w:top w:val="single" w:color="1C2B4A" w:sz="1"/>
+              <w:left w:val="single" w:color="1C2B4A" w:sz="1"/>
+              <w:bottom w:val="single" w:color="1C2B4A" w:sz="1"/>
+              <w:right w:val="single" w:color="1C2B4A" w:sz="1"/>
             </w:tcBorders>
             <w:shd w:fill="EEE8F5" w:val="clear"/>
             <w:tcMar>
@@ -541,7 +541,7 @@
                 <w:sz w:val="19"/>
                 <w:szCs w:val="19"/>
               </w:rPr>
-              <w:t xml:space="preserve">Demand forecasting, reorder point automation, multi-location tracking, Vetspire integration (usage data, revenue pull, lot-level write-back), COGs management with admin-selectable denominator, full procurement intelligence via Vetcove, white goods supply monitoring, and MedSync Analytics with eleven date range presets, per-location filtering, six analytics sidebar panels, QuickBooks and Power BI export, and branded PDF and CSV reporting — all in one platform. Built from Scout’s own SOP methodology.</w:t>
+              <w:t xml:space="preserve">Demand forecasting, reorder point automation, multi-location tracking, Vetspire integration (usage data, revenue pull, Min/Max write-back live; lot-level write-back Phase 2), COGs management with admin-selectable denominator, procurement intelligence (PDF export Phase 1; live Vetcove API Phase 2), white goods supply monitoring, and MedSync Analytics with eleven date range presets, per-location filtering, six analytics sidebar panels, QuickBooks and Power BI export, and branded PDF and CSV reporting — all in one platform. Built from Scout’s own SOP methodology.</w:t>
             </w:r>
           </w:p>
         </w:tc>
@@ -1105,7 +1105,9 @@
             <w:r>
               <w:rPr>
                 <w:rFonts w:ascii="Arial" w:cs="Arial" w:eastAsia="Arial" w:hAnsi="Arial"/>
-                <w:color w:val="8899AA"/>
+                <w:b/>
+                <w:bCs/>
+                <w:color w:val="FFFFFF"/>
                 <w:sz w:val="17"/>
                 <w:szCs w:val="17"/>
               </w:rPr>
@@ -1151,7 +1153,9 @@
             <w:r>
               <w:rPr>
                 <w:rFonts w:ascii="Arial" w:cs="Arial" w:eastAsia="Arial" w:hAnsi="Arial"/>
-                <w:color w:val="8899AA"/>
+                <w:b/>
+                <w:bCs/>
+                <w:color w:val="FFFFFF"/>
                 <w:sz w:val="17"/>
                 <w:szCs w:val="17"/>
               </w:rPr>
@@ -1197,7 +1201,9 @@
             <w:r>
               <w:rPr>
                 <w:rFonts w:ascii="Arial" w:cs="Arial" w:eastAsia="Arial" w:hAnsi="Arial"/>
-                <w:color w:val="8899AA"/>
+                <w:b/>
+                <w:bCs/>
+                <w:color w:val="FFFFFF"/>
                 <w:sz w:val="17"/>
                 <w:szCs w:val="17"/>
               </w:rPr>
@@ -1243,7 +1249,9 @@
             <w:r>
               <w:rPr>
                 <w:rFonts w:ascii="Arial" w:cs="Arial" w:eastAsia="Arial" w:hAnsi="Arial"/>
-                <w:color w:val="8899AA"/>
+                <w:b/>
+                <w:bCs/>
+                <w:color w:val="FFFFFF"/>
                 <w:sz w:val="17"/>
                 <w:szCs w:val="17"/>
               </w:rPr>
@@ -1462,10 +1470,10 @@
           <w:tcPr>
             <w:tcW w:type="dxa" w:w="10800"/>
             <w:tcBorders>
-              <w:top w:val="single" w:color="8899AA" w:sz="1"/>
-              <w:left w:val="single" w:color="8899AA" w:sz="1"/>
-              <w:bottom w:val="single" w:color="8899AA" w:sz="1"/>
-              <w:right w:val="single" w:color="8899AA" w:sz="1"/>
+              <w:top w:val="single" w:color="1C2B4A" w:sz="1"/>
+              <w:left w:val="single" w:color="1C2B4A" w:sz="1"/>
+              <w:bottom w:val="single" w:color="1C2B4A" w:sz="1"/>
+              <w:right w:val="single" w:color="1C2B4A" w:sz="1"/>
             </w:tcBorders>
             <w:shd w:fill="8899AA" w:val="clear"/>
             <w:tcMar>
@@ -2266,10 +2274,10 @@
           <w:tcPr>
             <w:tcW w:type="dxa" w:w="10800"/>
             <w:tcBorders>
-              <w:top w:val="single" w:color="8899AA" w:sz="1"/>
-              <w:left w:val="single" w:color="8899AA" w:sz="1"/>
-              <w:bottom w:val="single" w:color="8899AA" w:sz="1"/>
-              <w:right w:val="single" w:color="8899AA" w:sz="1"/>
+              <w:top w:val="single" w:color="1C2B4A" w:sz="1"/>
+              <w:left w:val="single" w:color="1C2B4A" w:sz="1"/>
+              <w:bottom w:val="single" w:color="1C2B4A" w:sz="1"/>
+              <w:right w:val="single" w:color="1C2B4A" w:sz="1"/>
             </w:tcBorders>
             <w:shd w:fill="8899AA" w:val="clear"/>
             <w:tcMar>
@@ -2338,7 +2346,7 @@
           <w:sz w:val="20"/>
           <w:szCs w:val="20"/>
         </w:rPr>
-        <w:t xml:space="preserve">MedSync Solutions Co. is a cloud-based veterinary inventory software platform that takes everything a high-performing Inventory Lead does manually today — forecasting, ordering, tracking, reporting, and loss management — and makes it automatic, scalable, and accessible from day one at every location.</w:t>
+        <w:t xml:space="preserve">MedSync Solutions Co. is a clinical inventory intelligence company. Its founding product is MedSync: a cloud-based veterinary inventory platform that takes everything a high-performing Inventory Lead does manually today — forecasting, ordering, tracking, reporting, and loss management — and makes it automatic, scalable, and accessible from day one at every location. Veterinary is the first vertical because that is where the founding expertise lives and the live proof exists. Human healthcare and other clinical settings are the natural second — the methodology scales directly. MedSync Solutions Co. is designed from the start to be the inventory intelligence layer for any clinical operation, not just veterinary.</w:t>
       </w:r>
     </w:p>
     <w:p>
@@ -3095,7 +3103,7 @@
                 <w:sz w:val="19"/>
                 <w:szCs w:val="19"/>
               </w:rPr>
-              <w:t xml:space="preserve">Lot-level write-back</w:t>
+              <w:t xml:space="preserve">Lot-level write-back (Phase 2)</w:t>
             </w:r>
           </w:p>
         </w:tc>
@@ -3219,7 +3227,7 @@
                 <w:sz w:val="19"/>
                 <w:szCs w:val="19"/>
               </w:rPr>
-              <w:t xml:space="preserve">VetSpire dispense write-back</w:t>
+              <w:t xml:space="preserve">VetSpire dispense write-back (Phase 2)</w:t>
             </w:r>
           </w:p>
         </w:tc>
@@ -3571,7 +3579,7 @@
                 <w:sz w:val="19"/>
                 <w:szCs w:val="19"/>
               </w:rPr>
-              <w:t xml:space="preserve">Live multi-vendor price comparison</w:t>
+              <w:t xml:space="preserve">Live multi-vendor price comparison (Phase 2)</w:t>
             </w:r>
           </w:p>
         </w:tc>
@@ -5561,7 +5569,7 @@
                 <w:rFonts w:ascii="Arial" w:cs="Arial" w:eastAsia="Arial" w:hAnsi="Arial"/>
                 <w:b/>
                 <w:bCs/>
-                <w:color w:val="8899AA"/>
+                <w:color w:val="FFFFFF"/>
                 <w:sz w:val="15"/>
                 <w:szCs w:val="15"/>
               </w:rPr>
@@ -5595,7 +5603,7 @@
                 <w:rFonts w:ascii="Arial" w:cs="Arial" w:eastAsia="Arial" w:hAnsi="Arial"/>
                 <w:b/>
                 <w:bCs/>
-                <w:color w:val="8899AA"/>
+                <w:color w:val="FFFFFF"/>
                 <w:sz w:val="15"/>
                 <w:szCs w:val="15"/>
               </w:rPr>
@@ -5629,45 +5637,11 @@
                 <w:rFonts w:ascii="Arial" w:cs="Arial" w:eastAsia="Arial" w:hAnsi="Arial"/>
                 <w:b/>
                 <w:bCs/>
-                <w:color w:val="8899AA"/>
+                <w:color w:val="FFFFFF"/>
                 <w:sz w:val="15"/>
                 <w:szCs w:val="15"/>
               </w:rPr>
               <w:t xml:space="preserve">STEP 03</w:t>
-            </w:r>
-          </w:p>
-        </w:tc>
-        <w:tc>
-          <w:tcPr>
-            <w:tcW w:type="dxa" w:w="1872"/>
-            <w:tcBorders>
-              <w:top w:val="single" w:color="8899AA" w:sz="1"/>
-              <w:left w:val="single" w:color="8899AA" w:sz="1"/>
-              <w:bottom w:val="single" w:color="8899AA" w:sz="1"/>
-              <w:right w:val="single" w:color="8899AA" w:sz="1"/>
-            </w:tcBorders>
-            <w:shd w:fill="8899AA" w:val="clear"/>
-            <w:tcMar>
-              <w:top w:type="dxa" w:w="100"/>
-              <w:left w:type="dxa" w:w="160"/>
-              <w:bottom w:type="dxa" w:w="100"/>
-              <w:right w:type="dxa" w:w="160"/>
-            </w:tcMar>
-          </w:tcPr>
-          <w:p>
-            <w:pPr>
-              <w:jc w:val="center"/>
-            </w:pPr>
-            <w:r>
-              <w:rPr>
-                <w:rFonts w:ascii="Arial" w:cs="Arial" w:eastAsia="Arial" w:hAnsi="Arial"/>
-                <w:b/>
-                <w:bCs/>
-                <w:color w:val="8899AA"/>
-                <w:sz w:val="15"/>
-                <w:szCs w:val="15"/>
-              </w:rPr>
-              <w:t xml:space="preserve">STEP 04</w:t>
             </w:r>
           </w:p>
         </w:tc>
@@ -5680,7 +5654,7 @@
               <w:bottom w:val="single" w:color="1C2B4A" w:sz="1"/>
               <w:right w:val="single" w:color="1C2B4A" w:sz="1"/>
             </w:tcBorders>
-            <w:shd w:fill="1C2B4A" w:val="clear"/>
+            <w:shd w:fill="8899AA" w:val="clear"/>
             <w:tcMar>
               <w:top w:type="dxa" w:w="100"/>
               <w:left w:type="dxa" w:w="160"/>
@@ -5697,7 +5671,41 @@
                 <w:rFonts w:ascii="Arial" w:cs="Arial" w:eastAsia="Arial" w:hAnsi="Arial"/>
                 <w:b/>
                 <w:bCs/>
-                <w:color w:val="8899AA"/>
+                <w:color w:val="FFFFFF"/>
+                <w:sz w:val="15"/>
+                <w:szCs w:val="15"/>
+              </w:rPr>
+              <w:t xml:space="preserve">STEP 04</w:t>
+            </w:r>
+          </w:p>
+        </w:tc>
+        <w:tc>
+          <w:tcPr>
+            <w:tcW w:type="dxa" w:w="1872"/>
+            <w:tcBorders>
+              <w:top w:val="single" w:color="1C2B4A" w:sz="1"/>
+              <w:left w:val="single" w:color="1C2B4A" w:sz="1"/>
+              <w:bottom w:val="single" w:color="1C2B4A" w:sz="1"/>
+              <w:right w:val="single" w:color="1C2B4A" w:sz="1"/>
+            </w:tcBorders>
+            <w:shd w:fill="1C2B4A" w:val="clear"/>
+            <w:tcMar>
+              <w:top w:type="dxa" w:w="100"/>
+              <w:left w:type="dxa" w:w="160"/>
+              <w:bottom w:type="dxa" w:w="100"/>
+              <w:right w:type="dxa" w:w="160"/>
+            </w:tcMar>
+          </w:tcPr>
+          <w:p>
+            <w:pPr>
+              <w:jc w:val="center"/>
+            </w:pPr>
+            <w:r>
+              <w:rPr>
+                <w:rFonts w:ascii="Arial" w:cs="Arial" w:eastAsia="Arial" w:hAnsi="Arial"/>
+                <w:b/>
+                <w:bCs/>
+                <w:color w:val="FFFFFF"/>
                 <w:sz w:val="15"/>
                 <w:szCs w:val="15"/>
               </w:rPr>
@@ -5813,10 +5821,10 @@
           <w:tcPr>
             <w:tcW w:type="dxa" w:w="1872"/>
             <w:tcBorders>
-              <w:top w:val="single" w:color="8899AA" w:sz="1"/>
-              <w:left w:val="single" w:color="8899AA" w:sz="1"/>
-              <w:bottom w:val="single" w:color="8899AA" w:sz="1"/>
-              <w:right w:val="single" w:color="8899AA" w:sz="1"/>
+              <w:top w:val="single" w:color="1C2B4A" w:sz="1"/>
+              <w:left w:val="single" w:color="1C2B4A" w:sz="1"/>
+              <w:bottom w:val="single" w:color="1C2B4A" w:sz="1"/>
+              <w:right w:val="single" w:color="1C2B4A" w:sz="1"/>
             </w:tcBorders>
             <w:shd w:fill="8899AA" w:val="clear"/>
             <w:tcMar>
@@ -6989,17 +6997,17 @@
         </w:tblBorders>
       </w:tblPr>
       <w:tblGrid>
-        <w:gridCol w:w="2200"/>
-        <w:gridCol w:w="1400"/>
-        <w:gridCol w:w="1600"/>
-        <w:gridCol w:w="1600"/>
-        <w:gridCol w:w="1400"/>
-        <w:gridCol w:w="1160"/>
+        <w:gridCol w:w="1700"/>
+        <w:gridCol w:w="1300"/>
+        <w:gridCol w:w="1500"/>
+        <w:gridCol w:w="1500"/>
+        <w:gridCol w:w="1200"/>
+        <w:gridCol w:w="2160"/>
       </w:tblGrid>
       <w:tr>
         <w:tc>
           <w:tcPr>
-            <w:tcW w:type="dxa" w:w="2200"/>
+            <w:tcW w:type="dxa" w:w="1700"/>
             <w:tcBorders>
               <w:top w:val="single" w:color="1C2B4A" w:sz="1"/>
               <w:left w:val="single" w:color="1C2B4A" w:sz="1"/>
@@ -7030,7 +7038,7 @@
         </w:tc>
         <w:tc>
           <w:tcPr>
-            <w:tcW w:type="dxa" w:w="1400"/>
+            <w:tcW w:type="dxa" w:w="1300"/>
             <w:tcBorders>
               <w:top w:val="single" w:color="1C2B4A" w:sz="1"/>
               <w:left w:val="single" w:color="1C2B4A" w:sz="1"/>
@@ -7061,7 +7069,7 @@
         </w:tc>
         <w:tc>
           <w:tcPr>
-            <w:tcW w:type="dxa" w:w="1600"/>
+            <w:tcW w:type="dxa" w:w="1500"/>
             <w:tcBorders>
               <w:top w:val="single" w:color="1C2B4A" w:sz="1"/>
               <w:left w:val="single" w:color="1C2B4A" w:sz="1"/>
@@ -7092,7 +7100,7 @@
         </w:tc>
         <w:tc>
           <w:tcPr>
-            <w:tcW w:type="dxa" w:w="1600"/>
+            <w:tcW w:type="dxa" w:w="1500"/>
             <w:tcBorders>
               <w:top w:val="single" w:color="1C2B4A" w:sz="1"/>
               <w:left w:val="single" w:color="1C2B4A" w:sz="1"/>
@@ -7123,7 +7131,7 @@
         </w:tc>
         <w:tc>
           <w:tcPr>
-            <w:tcW w:type="dxa" w:w="1400"/>
+            <w:tcW w:type="dxa" w:w="1300"/>
             <w:tcBorders>
               <w:top w:val="single" w:color="1C2B4A" w:sz="1"/>
               <w:left w:val="single" w:color="1C2B4A" w:sz="1"/>
@@ -7154,7 +7162,7 @@
         </w:tc>
         <w:tc>
           <w:tcPr>
-            <w:tcW w:type="dxa" w:w="1160"/>
+            <w:tcW w:type="dxa" w:w="2160"/>
             <w:tcBorders>
               <w:top w:val="single" w:color="1C2B4A" w:sz="1"/>
               <w:left w:val="single" w:color="1C2B4A" w:sz="1"/>
@@ -7187,7 +7195,7 @@
       <w:tr>
         <w:tc>
           <w:tcPr>
-            <w:tcW w:type="dxa" w:w="2200"/>
+            <w:tcW w:type="dxa" w:w="1700"/>
             <w:tcBorders>
               <w:top w:val="single" w:color="DDDDDD" w:sz="1"/>
               <w:left w:val="single" w:color="DDDDDD" w:sz="1"/>
@@ -7216,7 +7224,7 @@
         </w:tc>
         <w:tc>
           <w:tcPr>
-            <w:tcW w:type="dxa" w:w="1400"/>
+            <w:tcW w:type="dxa" w:w="1300"/>
             <w:tcBorders>
               <w:top w:val="single" w:color="DDDDDD" w:sz="1"/>
               <w:left w:val="single" w:color="DDDDDD" w:sz="1"/>
@@ -7539,10 +7547,10 @@
           <w:tcPr>
             <w:tcW w:type="dxa" w:w="2200"/>
             <w:tcBorders>
-              <w:top w:val="single" w:color="8899AA" w:sz="1"/>
-              <w:left w:val="single" w:color="8899AA" w:sz="1"/>
-              <w:bottom w:val="single" w:color="8899AA" w:sz="1"/>
-              <w:right w:val="single" w:color="8899AA" w:sz="1"/>
+              <w:top w:val="single" w:color="1C2B4A" w:sz="1"/>
+              <w:left w:val="single" w:color="1C2B4A" w:sz="1"/>
+              <w:bottom w:val="single" w:color="1C2B4A" w:sz="1"/>
+              <w:right w:val="single" w:color="1C2B4A" w:sz="1"/>
             </w:tcBorders>
             <w:shd w:fill="EEE8F5" w:val="clear"/>
             <w:tcMar>
@@ -7570,10 +7578,10 @@
           <w:tcPr>
             <w:tcW w:type="dxa" w:w="1400"/>
             <w:tcBorders>
-              <w:top w:val="single" w:color="8899AA" w:sz="1"/>
-              <w:left w:val="single" w:color="8899AA" w:sz="1"/>
-              <w:bottom w:val="single" w:color="8899AA" w:sz="1"/>
-              <w:right w:val="single" w:color="8899AA" w:sz="1"/>
+              <w:top w:val="single" w:color="1C2B4A" w:sz="1"/>
+              <w:left w:val="single" w:color="1C2B4A" w:sz="1"/>
+              <w:bottom w:val="single" w:color="1C2B4A" w:sz="1"/>
+              <w:right w:val="single" w:color="1C2B4A" w:sz="1"/>
             </w:tcBorders>
             <w:shd w:fill="EEE8F5" w:val="clear"/>
             <w:tcMar>
@@ -7601,10 +7609,10 @@
           <w:tcPr>
             <w:tcW w:type="dxa" w:w="1600"/>
             <w:tcBorders>
-              <w:top w:val="single" w:color="8899AA" w:sz="1"/>
-              <w:left w:val="single" w:color="8899AA" w:sz="1"/>
-              <w:bottom w:val="single" w:color="8899AA" w:sz="1"/>
-              <w:right w:val="single" w:color="8899AA" w:sz="1"/>
+              <w:top w:val="single" w:color="1C2B4A" w:sz="1"/>
+              <w:left w:val="single" w:color="1C2B4A" w:sz="1"/>
+              <w:bottom w:val="single" w:color="1C2B4A" w:sz="1"/>
+              <w:right w:val="single" w:color="1C2B4A" w:sz="1"/>
             </w:tcBorders>
             <w:shd w:fill="EEE8F5" w:val="clear"/>
             <w:tcMar>
@@ -7630,10 +7638,10 @@
           <w:tcPr>
             <w:tcW w:type="dxa" w:w="1600"/>
             <w:tcBorders>
-              <w:top w:val="single" w:color="8899AA" w:sz="1"/>
-              <w:left w:val="single" w:color="8899AA" w:sz="1"/>
-              <w:bottom w:val="single" w:color="8899AA" w:sz="1"/>
-              <w:right w:val="single" w:color="8899AA" w:sz="1"/>
+              <w:top w:val="single" w:color="1C2B4A" w:sz="1"/>
+              <w:left w:val="single" w:color="1C2B4A" w:sz="1"/>
+              <w:bottom w:val="single" w:color="1C2B4A" w:sz="1"/>
+              <w:right w:val="single" w:color="1C2B4A" w:sz="1"/>
             </w:tcBorders>
             <w:shd w:fill="EEE8F5" w:val="clear"/>
             <w:tcMar>
@@ -7661,10 +7669,10 @@
           <w:tcPr>
             <w:tcW w:type="dxa" w:w="1400"/>
             <w:tcBorders>
-              <w:top w:val="single" w:color="8899AA" w:sz="1"/>
-              <w:left w:val="single" w:color="8899AA" w:sz="1"/>
-              <w:bottom w:val="single" w:color="8899AA" w:sz="1"/>
-              <w:right w:val="single" w:color="8899AA" w:sz="1"/>
+              <w:top w:val="single" w:color="1C2B4A" w:sz="1"/>
+              <w:left w:val="single" w:color="1C2B4A" w:sz="1"/>
+              <w:bottom w:val="single" w:color="1C2B4A" w:sz="1"/>
+              <w:right w:val="single" w:color="1C2B4A" w:sz="1"/>
             </w:tcBorders>
             <w:shd w:fill="EEE8F5" w:val="clear"/>
             <w:tcMar>
@@ -7692,10 +7700,10 @@
           <w:tcPr>
             <w:tcW w:type="dxa" w:w="1160"/>
             <w:tcBorders>
-              <w:top w:val="single" w:color="8899AA" w:sz="1"/>
-              <w:left w:val="single" w:color="8899AA" w:sz="1"/>
-              <w:bottom w:val="single" w:color="8899AA" w:sz="1"/>
-              <w:right w:val="single" w:color="8899AA" w:sz="1"/>
+              <w:top w:val="single" w:color="1C2B4A" w:sz="1"/>
+              <w:left w:val="single" w:color="1C2B4A" w:sz="1"/>
+              <w:bottom w:val="single" w:color="1C2B4A" w:sz="1"/>
+              <w:right w:val="single" w:color="1C2B4A" w:sz="1"/>
             </w:tcBorders>
             <w:shd w:fill="EEE8F5" w:val="clear"/>
             <w:tcMar>
@@ -8856,10 +8864,10 @@
           <w:tcPr>
             <w:tcW w:type="dxa" w:w="4680"/>
             <w:tcBorders>
-              <w:top w:val="single" w:color="8899AA" w:sz="1"/>
-              <w:left w:val="single" w:color="8899AA" w:sz="1"/>
-              <w:bottom w:val="single" w:color="8899AA" w:sz="1"/>
-              <w:right w:val="single" w:color="8899AA" w:sz="1"/>
+              <w:top w:val="single" w:color="1C2B4A" w:sz="1"/>
+              <w:left w:val="single" w:color="1C2B4A" w:sz="1"/>
+              <w:bottom w:val="single" w:color="1C2B4A" w:sz="1"/>
+              <w:right w:val="single" w:color="1C2B4A" w:sz="1"/>
             </w:tcBorders>
             <w:shd w:fill="EEE8F5" w:val="clear"/>
             <w:tcMar>
@@ -13149,7 +13157,7 @@
           <w:sz w:val="20"/>
           <w:szCs w:val="20"/>
         </w:rPr>
-        <w:t xml:space="preserve">When the Inventory Lead  Admin D is not on-site, deliveries still arrive. The current workflow — unboxing, manually checking off items against the packing slip, setting aside for the IL to update later — is error-prone and creates a lag between receipt and system accuracy. MedSync solves this with a purpose-built Hospital Receiver role: a shared device login that gives any staff member access to exactly two workflows. The first thing they see after logging in is a single question: what would you like to do today? They choose. They proceed. Nothing else is visible.</w:t>
+        <w:t xml:space="preserve">When the Inventory Lead is not on-site, deliveries still arrive. The current workflow — unboxing, manually checking off items against the packing slip, setting aside for the IL to update later — is error-prone and creates a lag between receipt and system accuracy. MedSync solves this with a purpose-built Hospital Receiver role: a shared device login that gives any staff member access to exactly two workflows. The first thing they see after logging in is a single question: what would you like to do today? They choose. They proceed. Nothing else is visible.</w:t>
       </w:r>
     </w:p>
     <w:tbl>
@@ -13473,7 +13481,7 @@
                 <w:sz w:val="19"/>
                 <w:szCs w:val="19"/>
               </w:rPr>
-              <w:t xml:space="preserve">For receiving sessions: sent automatically when the session closes. Contains location, date and time, receiver name (first name + last initial), every product scanned with lot number, expiration date, quantity, and matched PO line, any items marked as damaged inline (product, lot, quantity, flagged as Damaged/Spilled, attributed to receiver), any items that did not match an open PO (flagged, not described to the receiver), and open PO status showing any line items not yet received. For standalone goods lost submissions: a separate notification is sent at submission time. Contains location, date and time, receiver name, product, loss category, and quantity. In both cases the Admin r COD has everything they need to act — and if everything looks correct, no action is required.</w:t>
+              <w:t xml:space="preserve">For receiving sessions: sent automatically when the session closes. Contains location, date and time, receiver name (first name + last initial), every product scanned with lot number, expiration date, quantity, and matched PO line, any items marked as damaged inline (product, lot, quantity, flagged as Damaged/Spilled, attributed to receiver), any items that did not match an open PO (flagged, not described to the receiver), and open PO status showing any line items not yet received. For standalone goods lost submissions: a separate notification is sent at submission time. Contains location, date and time, receiver name, product, loss category, and quantity. In both cases the Admin or COD has everything they need to act — and if everything looks correct, no action is required.</w:t>
             </w:r>
           </w:p>
         </w:tc>
@@ -17538,7 +17546,7 @@
                 <w:sz w:val="19"/>
                 <w:szCs w:val="19"/>
               </w:rPr>
-              <w:t xml:space="preserve">COD visibility</w:t>
+              <w:t xml:space="preserve">Admin visibility</w:t>
             </w:r>
           </w:p>
         </w:tc>
@@ -18059,7 +18067,7 @@
                 <w:sz w:val="19"/>
                 <w:szCs w:val="19"/>
               </w:rPr>
-              <w:t xml:space="preserve">One shared device login per location — the tablet or phone stays at the receiving area. The first screen after login asks: “What would you like to do today?” Two tap targets: Receive a delivery, or Submit goods lost. The receiver taps their task, enters their first name and last initial, and goes directly to that workflow. In the receiving workflow, scanning is the only action — any item that arrives damaged can be marked inline by tapping it and selecting “Mark as damaged,” creating a goods lost entry without leaving the scan screen. In the goods lost workflow, they scan or search a product, select from all six loss categories (Expired Product, Diagnostic Duplicate, Damaged or Spilled, Medication Waste, In-house Use, Donated), enter a quantity, and submit. When they tap “Complete session,” a notification email goes to th Admin and COD with every item received, any damage flags, unmatched PO items, and open PO status. No VetSpire access. No inventory permissions. No margin for error on the counts that matter.</w:t>
+              <w:t xml:space="preserve">One shared device login per location — the tablet or phone stays at the receiving area. The first screen after login asks: “What would you like to do today?” Two tap targets: Receive a delivery, or Submit goods lost. The receiver taps their task, enters their first name and last initial, and goes directly to that workflow. In the receiving workflow, scanning is the only action — any item that arrives damaged can be marked inline by tapping it and selecting “Mark as damaged,” creating a goods lost entry without leaving the scan screen. In the goods lost workflow, they scan or search a product, select from all six loss categories (Expired Product, Diagnostic Duplicate, Damaged or Spilled, Medication Waste, In-house Use, Donated), enter a quantity, and submit. When they tap “Complete session,” a notification email goes to the Admin and COD with every item received, any damage flags, unmatched PO items, and open PO status. No VetSpire access. No inventory permissions. No margin for error on the counts that matter.</w:t>
             </w:r>
           </w:p>
         </w:tc>
@@ -19008,7 +19016,7 @@
                 <w:sz w:val="17"/>
                 <w:szCs w:val="17"/>
               </w:rPr>
-              <w:t xml:space="preserve">Ordering rate vs. appointment volume across all locations. Expected vs. actual rate, divergence percentage, and estimated monthly overspend for every flagged location. Admin-only consumption rate assumption table with per-location settings, Edit control, and full change log. 넕15% tolerance before flag fires.</w:t>
+              <w:t xml:space="preserve">Ordering rate vs. appointment volume across all locations. Expected vs. actual rate, divergence percentage, and estimated monthly overspend for every flagged location. Admin-only consumption rate assumption table with per-location settings, Edit control, and full change log. ±15% tolerance before flag fires.</w:t>
             </w:r>
           </w:p>
         </w:tc>
@@ -19928,7 +19936,7 @@
           <w:sz w:val="20"/>
           <w:szCs w:val="20"/>
         </w:rPr>
-        <w:t xml:space="preserve">When Scout locations go live on the full production MedSync platform in January 2028, and at every new location thereafter, the MedSync implementation team goes on-site and conducts a complete manual count of every saleable item in the hospital — every medication, every supply, every unit. No estimates. No import from a prior system. A clean, verified count entered directly into MedSync by the implementation team alongside the Inventory Lead.</w:t>
+        <w:t xml:space="preserve">When Scout locations go live on MedSync in Q4 2026, and at every new location thereafter, the MedSync implementation team goes on-site and conducts a complete manual count of every saleable item in the hospital — every medication, every supply, every unit. No estimates. No import from a prior system. A clean, verified count entered directly into MedSync by the implementation team alongside the Inventory Lead.</w:t>
       </w:r>
     </w:p>
     <w:p>
@@ -26151,7 +26159,7 @@
                 <w:sz w:val="17"/>
                 <w:szCs w:val="17"/>
               </w:rPr>
-              <w:t xml:space="preserve">2029 native iOS + Android at market launch</w:t>
+              <w:t xml:space="preserve">2028 native iOS + Android at market launch</w:t>
             </w:r>
           </w:p>
         </w:tc>
@@ -29064,7 +29072,7 @@
           <w:sz w:val="20"/>
           <w:szCs w:val="20"/>
         </w:rPr>
-        <w:t xml:space="preserve">What MedSync represents today is not a pitch deck or a wireframe. It is a working system with validated logic, a defined methodology, a complete product specification, and a clear three-year path: build in 2027, validate across Scout in 2028, launch to the external market in 2029. The investment ask funds a defined plan — not a concept. Tiered pricing means revenue per customer scales with practice complexity, improving both break-even speed and long-term ARR potential beyond the flat-rate projections. That combination places MedSync in a significantly stronger pre-development position than most early-stage software investments.</w:t>
+        <w:t xml:space="preserve">What MedSync represents today is not a pitch deck or a wireframe. It is a working platform with validated methodology, active Vetspire integration, and a four-hospital deployment ready to begin this quarter. The path is a clear three years: deploy at Scout in Q4 2026, validate ROI and refine through 2027, launch to the external market in 2028. The investment ask funds execution of a plan that is already in motion — not a concept that still needs to be proved. That combination places MedSync in a category most early-stage software investments never reach: a product that already works, deployed on the investor’s own operations, generating ROI before the first external customer is approached.</w:t>
       </w:r>
     </w:p>
     <w:p>
@@ -30465,7 +30473,7 @@
                 <w:sz w:val="19"/>
                 <w:szCs w:val="19"/>
               </w:rPr>
-              <w:t xml:space="preserve">$650,000 – $850,000 seed investment — sized to fund the 2027 build, the 2028 Scout pilot, and the first half of 2029 market launch with a prudent operating reserve</w:t>
+              <w:t xml:space="preserve">$400,000 – $550,000 deployment investment — sized to deploy the working platform at Scout in Q4 2026, validate ROI through 2027, and fund the 2028 external market launch with operating reserve</w:t>
             </w:r>
           </w:p>
         </w:tc>
@@ -30651,7 +30659,7 @@
                 <w:sz w:val="19"/>
                 <w:szCs w:val="19"/>
               </w:rPr>
-              <w:t xml:space="preserve">2027 build — technical development $165K–$300K (tech co-founder, nearshore dev, cloud + APIs, tooling, legal). Working deployed application at MedSync.vet reduces exploratory build costs and ramp-up time. 2027 operating — CPO supplement + tools + conference research $34K–$44K. 2028 Scout pilot — CEO/sales hire, customer success hire, marketing hire, platform maintenance, conferences, case study production $161K–$228K net of Scout revenue. H1 2029 runway — full team operating costs before external revenue ramps $207K–$284K net of early customer revenue. Total capital need: $598K–$879K. Investment of $650K–$850K funds the full plan with operating reserve.</w:t>
+              <w:t xml:space="preserve">Q4 2026 Scout deployment — technical co-founder onboarding, platform hardening, Scout rollout $60K–$80K. 2027 Scout validation year — tech co-founder full year, CPO supplement, platform iteration, ROI documentation, case study production $140K–$180K net of Scout revenue ($71,520 ARR begins Q4 2026). 2028 market launch prep — CEO/Head of Sales hire Q1 2028, customer success hire, conference presence, first external customers $160K–$220K net of growing revenue. Operating reserve $40K–$70K. Total capital need: $400K–$550K. Investment of $400K–$550K funds the full plan. The build is already done — this is deployment and scale capital.</w:t>
             </w:r>
           </w:p>
         </w:tc>
@@ -30956,7 +30964,7 @@
                 <w:sz w:val="20"/>
                 <w:szCs w:val="20"/>
               </w:rPr>
-              <w:t xml:space="preserve">The ask in this conversation is $650,000 to $850,000 — sized precisely to fund the 2027 platform build, the 2028 Scout pilot, and the first half of 2029 market launch with a prudent operating reserve. Not a round number chosen to sound like a seed round. A number derived from a line-by-line capital needs analysis. Does Thurlow want to own a piece of the technology platform that was built on Thurlow data, solves Thurlow operational problems, and will give Thurlow a proprietary advantage at 40+ locations — while generating independent revenue from the 30,000+ other practices that need exactly the same thing?</w:t>
+              <w:t xml:space="preserve">The ask in this conversation is $400,000 to $550,000 — sized to deploy an already-working platform at Scout this quarter, fund the technical co-founder who professionalizes the codebase through 2027, and carry the team through the 2028 external launch with a prudent operating reserve. The build phase is substantially complete. This is deployment capital, not development capital — and that distinction makes it one of the lowest-risk seed investments in veterinary technology. Does Thurlow want to own a piece of a platform that was built on Thurlow data, is already running on Scout’s live inventory tonight, will start generating ROI at Scout before the end of 2026, and will give Thurlow a proprietary advantage at 40+ locations — while generating independent revenue from the 30,000+ other practices that need exactly the same thing?</w:t>
             </w:r>
           </w:p>
         </w:tc>
@@ -31059,7 +31067,7 @@
           <w:sz w:val="20"/>
           <w:szCs w:val="20"/>
         </w:rPr>
-        <w:t xml:space="preserve">Most startups have to hire a finance director, build marketing from scratch, establish HR, and figure out back-office operations before they write a line of code. MedSync starts with all of that already in place inside Thurlow Veterinary Services Inc. That is not a minor advantage — that is $300K–$500K in annual overhead that MedSync does not need to carry during the build and Scout pilot phases — directly reducing the capital required and making the $650K–$850K ask go further than it would for any standalone startup.</w:t>
+        <w:t xml:space="preserve">Most startups have to hire a finance director, build marketing from scratch, establish HR, and figure out back-office operations before they write a line of code. MedSync starts with all of that already in place inside Thurlow Veterinary Services Inc. That is not a minor advantage — that is $300K–$500K in annual overhead that MedSync does not need to carry during the build and Scout pilot phases — directly reducing the capital required and making the $400K–$550K ask go further than it would for any standalone startup.</w:t>
       </w:r>
     </w:p>
     <w:p>
@@ -31242,7 +31250,7 @@
                 <w:sz w:val="18"/>
                 <w:szCs w:val="18"/>
               </w:rPr>
-              <w:t xml:space="preserve">2027 Build</w:t>
+              <w:t xml:space="preserve">Q4 2026 – 2027 Deployment</w:t>
             </w:r>
           </w:p>
         </w:tc>
@@ -31273,7 +31281,7 @@
                 <w:sz w:val="18"/>
                 <w:szCs w:val="18"/>
               </w:rPr>
-              <w:t xml:space="preserve">2028 Scout Pilot</w:t>
+              <w:t xml:space="preserve">2027 Scout Validation</w:t>
             </w:r>
           </w:p>
         </w:tc>
@@ -31304,7 +31312,7 @@
                 <w:sz w:val="18"/>
                 <w:szCs w:val="18"/>
               </w:rPr>
-              <w:t xml:space="preserve">2029 Market Launch</w:t>
+              <w:t xml:space="preserve">2028 Market Launch</w:t>
             </w:r>
           </w:p>
         </w:tc>
@@ -31366,7 +31374,7 @@
                 <w:sz w:val="16"/>
                 <w:szCs w:val="16"/>
               </w:rPr>
-              <w:t xml:space="preserve">Megan Henley — Admin, Thurlow. Owns the product vision, methodology, and clinical accuracy of every MedSync feature. Not the primary external salesperson — the person who makes the product undeniable.</w:t>
+              <w:t xml:space="preserve">Megan Henley — COD (Clinical Operations Director), Scout Veterinary Urgent Care. Owns the product vision, methodology, and clinical accuracy of every MedSync feature. Not the primary external salesperson — the person who makes the product undeniable.</w:t>
             </w:r>
           </w:p>
         </w:tc>
@@ -31755,7 +31763,7 @@
                 <w:sz w:val="16"/>
                 <w:szCs w:val="16"/>
               </w:rPr>
-              <w:t xml:space="preserve">CEO or Head of Sales hire by Q2 2028 — ahead of Scout pilot completion. This person owns revenue, external company leadership, and investor relationships. Megan is not this person by design. The right hire is a business operator who believes in the product and can translate clinical value into commercial outcomes.</w:t>
+              <w:t xml:space="preserve">CEO or Head of Sales hire by Q1 2028 — ahead of Scout pilot completion. This person owns revenue, external company leadership, and investor relationships. Megan is not this person by design. The right hire is a business operator who believes in the product and can translate clinical value into commercial outcomes.</w:t>
             </w:r>
           </w:p>
         </w:tc>
@@ -32291,7 +32299,7 @@
           <w:sz w:val="23"/>
           <w:szCs w:val="23"/>
         </w:rPr>
-        <w:t xml:space="preserve">The minimum viable team at 2029 market launch:</w:t>
+        <w:t xml:space="preserve">The minimum viable team at 2028 market launch:</w:t>
       </w:r>
     </w:p>
     <w:p>
@@ -33596,7 +33604,7 @@
                 <w:sz w:val="20"/>
                 <w:szCs w:val="20"/>
               </w:rPr>
-              <w:t xml:space="preserve">At $249/month per practice group, each customer generates $2,988 in annual revenue. With dedicated MedSync payroll of $350K–$470K, full payroll break-even comes at approximately 130 customers — a Year 3 milestone, not Year 1. Year 1 targets 25 external customers ($74,700 ARR), covering roughly 21% of dedicated payroll. The investment funds the gap. That is what seed investment is for. Thurlow’s shared services — finance, HR, and marketing infrastructure already in place — mean the gap is significantly smaller than it would be for a standalone startup.</w:t>
+              <w:t xml:space="preserve">At $249/month per practice group, each customer generates $2,988 in annual revenue. With dedicated MedSync payroll of $350K–$470K, full payroll break-even comes at approximately 130 customers — a Year 3 milestone, not Year 1. Year 1 external targets 10–15 customers ($74,700–$112,000 ARR), covering 20–30% of dedicated payroll. Scout ARR ($71,520) covers the remainder of the gap alongside Thurlow shared services. The investment funds the gap. That is what seed investment is for. Thurlow’s shared services — finance, HR, and marketing infrastructure already in place — mean the gap is significantly smaller than it would be for a standalone startup.</w:t>
             </w:r>
           </w:p>
         </w:tc>
@@ -33958,7 +33966,7 @@
                 <w:sz w:val="17"/>
                 <w:szCs w:val="17"/>
               </w:rPr>
-              <w:t xml:space="preserve">2029</w:t>
+              <w:t xml:space="preserve">2028</w:t>
             </w:r>
           </w:p>
         </w:tc>
@@ -34111,7 +34119,7 @@
                 <w:sz w:val="17"/>
                 <w:szCs w:val="17"/>
               </w:rPr>
-              <w:t xml:space="preserve">2030</w:t>
+              <w:t xml:space="preserve">2029</w:t>
             </w:r>
           </w:p>
         </w:tc>
@@ -34264,7 +34272,7 @@
                 <w:sz w:val="17"/>
                 <w:szCs w:val="17"/>
               </w:rPr>
-              <w:t xml:space="preserve">2030–2031</w:t>
+              <w:t xml:space="preserve">2029–2030</w:t>
             </w:r>
           </w:p>
         </w:tc>
@@ -34417,7 +34425,7 @@
                 <w:sz w:val="17"/>
                 <w:szCs w:val="17"/>
               </w:rPr>
-              <w:t xml:space="preserve">Mid-2030 (realistic customer mix)</w:t>
+              <w:t xml:space="preserve">Mid-2029 (realistic customer mix)</w:t>
             </w:r>
           </w:p>
         </w:tc>
@@ -34570,7 +34578,7 @@
                 <w:sz w:val="17"/>
                 <w:szCs w:val="17"/>
               </w:rPr>
-              <w:t xml:space="preserve">2028 onward</w:t>
+              <w:t xml:space="preserve">2027 onward</w:t>
             </w:r>
           </w:p>
         </w:tc>
@@ -34627,7 +34635,7 @@
                 <w:sz w:val="20"/>
                 <w:szCs w:val="20"/>
               </w:rPr>
-              <w:t xml:space="preserve">Year 1 is not designed to break even. It is designed to prove the product works in a real clinical environment and generate the case study that makes the next 100 customers easier to close. The investment funds that proof. Thurlow's shared services reduce the gap. The 2028 Scout pilot is the asset that closes it.</w:t>
+              <w:t xml:space="preserve">Year 1 is not designed to break even. It is designed to prove the product works in a real clinical environment and generate the case study that makes the next 100 customers easier to close. The investment funds that proof. Thurlow’s shared services reduce the gap. The Q4 2026 Scout deployment — generating real data, real savings, and a documented case study through 2027 — is the asset that closes it.</w:t>
             </w:r>
           </w:p>
         </w:tc>
@@ -34854,7 +34862,7 @@
                 <w:sz w:val="19"/>
                 <w:szCs w:val="19"/>
               </w:rPr>
-              <w:t xml:space="preserve">HR infrastructure — employment law compliance, benefits administration, payroll, culture development — typically costs $80K–$120K in a standalone startup. Thurlow HR absorbs this entirely through at least 2029.</w:t>
+              <w:t xml:space="preserve">HR infrastructure — employment law compliance, benefits administration, payroll, culture development — typically costs $80K–$120K in a standalone startup. Thurlow HR absorbs this entirely through at least 2028.</w:t>
             </w:r>
           </w:p>
         </w:tc>
@@ -34916,7 +34924,7 @@
                 <w:sz w:val="19"/>
                 <w:szCs w:val="19"/>
               </w:rPr>
-              <w:t xml:space="preserve">Conservative estimate: $600K–$900K in cumulative overhead savings over the 2027–2029 build and pilot period. This is real money that the investment ask does not need to cover — because Thurlow already paid for it.</w:t>
+              <w:t xml:space="preserve">Conservative estimate: $600K–$900K in cumulative overhead savings over the 2026–2028 deployment and validation period. This is real money that the investment ask does not need to cover — because Thurlow already paid for it.</w:t>
             </w:r>
           </w:p>
         </w:tc>
@@ -36775,7 +36783,7 @@
           <w:sz w:val="20"/>
           <w:szCs w:val="20"/>
         </w:rPr>
-        <w:t xml:space="preserve">Beyond credibility, Tripp’s involvement as CEO directly reduces MedSync’s capital need. The $90K–$130K CEO salary line — plus equity and commission — represents the largest single personnel cost in the 2028 Scout pilot phase. Eliminating or deferring that line meaningfully extends the runway provided by the $650K–$850K seed investment, and it removes one of the hardest early hires any startup faces: finding someone who understands the product deeply enough to sell it credibly without having built it.</w:t>
+        <w:t xml:space="preserve">Beyond credibility, Tripp’s involvement as CEO directly reduces MedSync’s capital need. The $90K–$130K CEO salary line — plus equity and commission — represents the largest single personnel cost in the 2028 Scout pilot phase. Eliminating or deferring that line meaningfully extends the runway provided by the $400K–$550K deployment investment, and it removes one of the hardest early hires any startup faces: finding someone who understands the product deeply enough to sell it credibly without having built it.</w:t>
       </w:r>
     </w:p>
     <w:p>
@@ -36898,7 +36906,7 @@
                 <w:sz w:val="19"/>
                 <w:szCs w:val="19"/>
               </w:rPr>
-              <w:t xml:space="preserve">During the 2027 build phase, MedSync requires strategic direction and investor management — not a full-time sales operation. During the 2028 Scout pilot, MedSync’s “customer” is Thurlow itself. Tripp is already managing that relationship. The external commercial load that justifies a dedicated CEO hire does not materialize until the 2029 market launch — giving this structure a natural two-year runway before the question of delegation arises.</w:t>
+              <w:t xml:space="preserve">During the Q4 2026–2027 Scout deployment, MedSync’s “customer” is Thurlow itself. Tripp is already managing that relationship. Strategic direction and Scout deployment oversight are the work — not a full-time sales operation. The external commercial load that justifies a dedicated CEO hire does not materialize until the 2028 external launch — giving this structure a natural runway before the question of delegation arises.</w:t>
             </w:r>
           </w:p>
         </w:tc>
@@ -37186,7 +37194,7 @@
                 <w:sz w:val="19"/>
                 <w:szCs w:val="19"/>
               </w:rPr>
-              <w:t xml:space="preserve">2027 Build</w:t>
+              <w:t xml:space="preserve">Q4 2026–2027 Deployment</w:t>
             </w:r>
           </w:p>
         </w:tc>
@@ -37257,7 +37265,7 @@
                 <w:sz w:val="19"/>
                 <w:szCs w:val="19"/>
               </w:rPr>
-              <w:t xml:space="preserve">2028 Scout Pilot</w:t>
+              <w:t xml:space="preserve">2027 Scout Validation</w:t>
             </w:r>
           </w:p>
         </w:tc>
@@ -37328,7 +37336,7 @@
                 <w:sz w:val="19"/>
                 <w:szCs w:val="19"/>
               </w:rPr>
-              <w:t xml:space="preserve">2029 Market Launch</w:t>
+              <w:t xml:space="preserve">2028 Market Launch</w:t>
             </w:r>
           </w:p>
         </w:tc>
@@ -37809,7 +37817,7 @@
                 <w:sz w:val="19"/>
                 <w:szCs w:val="19"/>
               </w:rPr>
-              <w:t xml:space="preserve">Equity stake in the founding product of a Thurlow Technology Division — a diversified revenue stream built on Thurlow's existing operational infrastructure and expertise.</w:t>
+              <w:t xml:space="preserve">Equity stake in the founding product of a Thurlow Technology Division — a diversified revenue stream built on Thurlow's existing operational infrastructure and expertise. MedSync Solutions Co. is structured as a multi-vertical clinical inventory company; veterinary is the founding vertical, human healthcare is the planned second. Intellectual property strategy — including trademark registration for "MedSync" in software services (USPTO Class 42) — is a pre-incorporation action item prior to external market launch in 2028.</w:t>
             </w:r>
           </w:p>
         </w:tc>
@@ -38540,7 +38548,7 @@
                 <w:sz w:val="21"/>
                 <w:szCs w:val="21"/>
               </w:rPr>
-              <w:t xml:space="preserve">18  —  PRODUCT ROADMAP  |  2027 BUILD  ·  2028 SCOUT PILOT  ·  2029 MARKET LAUNCH</w:t>
+              <w:t xml:space="preserve">18  —  PRODUCT ROADMAP  |  Q4 2026–2027 SCOUT DEPLOYMENT  ·  2028 MARKET LAUNCH</w:t>
             </w:r>
           </w:p>
         </w:tc>
@@ -38670,7 +38678,7 @@
           <w:sz w:val="23"/>
           <w:szCs w:val="23"/>
         </w:rPr>
-        <w:t xml:space="preserve">2027 — Platform build and product design:</w:t>
+        <w:t xml:space="preserve">Q4 2026–2027 — Scout deployment and platform refinement:</w:t>
       </w:r>
     </w:p>
     <w:p>
@@ -38684,7 +38692,7 @@
           <w:sz w:val="20"/>
           <w:szCs w:val="20"/>
         </w:rPr>
-        <w:t xml:space="preserve">The remainder of 2027 is dedicated entirely to building and designing the platform — no external customers, no revenue pressure, no shortcuts. The goal is to arrive at January 2028 with a fully functional, internally tested product that is ready for Scout to run on in a live clinical environment.</w:t>
+        <w:t xml:space="preserve">Q4 2026 is dedicated to deploying MedSync across all four Scout locations — no external customers, no revenue pressure. The goal is to arrive at January 2027 with four locations running, real COGs data flowing, and the first documented ROI month in hand.</w:t>
       </w:r>
     </w:p>
     <w:p>
@@ -38739,7 +38747,7 @@
                 <w:sz w:val="18"/>
                 <w:szCs w:val="18"/>
               </w:rPr>
-              <w:t xml:space="preserve">Q1 2027</w:t>
+              <w:t xml:space="preserve">Q4 2026</w:t>
             </w:r>
           </w:p>
         </w:tc>
@@ -38801,7 +38809,7 @@
                 <w:sz w:val="18"/>
                 <w:szCs w:val="18"/>
               </w:rPr>
-              <w:t xml:space="preserve">Q2 2027</w:t>
+              <w:t xml:space="preserve">Q1 2027</w:t>
             </w:r>
           </w:p>
         </w:tc>
@@ -38863,7 +38871,7 @@
                 <w:sz w:val="18"/>
                 <w:szCs w:val="18"/>
               </w:rPr>
-              <w:t xml:space="preserve">Q3 2027</w:t>
+              <w:t xml:space="preserve">Q2 2027</w:t>
             </w:r>
           </w:p>
         </w:tc>
@@ -38925,7 +38933,7 @@
                 <w:sz w:val="18"/>
                 <w:szCs w:val="18"/>
               </w:rPr>
-              <w:t xml:space="preserve">Q4 2027</w:t>
+              <w:t xml:space="preserve">Q3–Q4 2027</w:t>
             </w:r>
           </w:p>
         </w:tc>
@@ -38954,7 +38962,7 @@
                 <w:sz w:val="18"/>
                 <w:szCs w:val="18"/>
               </w:rPr>
-              <w:t xml:space="preserve">Expiration intelligence module complete — Vetspire API pull, adjusted on-hand, expiration-aware purchase recommendations, inter-location transfer alerts. Benchmark Starter Program built for denovo practices. Portfolio COGs dashboard complete. Full UX design pass. Mobile-responsive web app confirmed across all key workflows: goods lost submission, on-hand checks, reorder alert review, and PO approval all functional on phone and tablet without a native app. Internal alpha testing with Megan and select IL team members. Product ready for Scout pilot January 2028.</w:t>
+              <w:t xml:space="preserve">Expiration intelligence module complete — Vetspire API pull, adjusted on-hand, expiration-aware purchase recommendations, inter-location transfer alerts. Benchmark Starter Program built for denovo practices. Portfolio COGs dashboard complete. Full UX design pass. Mobile-responsive web app confirmed across all key workflows: goods lost submission, on-hand checks, reorder alert review, and PO approval all functional on phone and tablet without a native app. Internal alpha testing with Megan and select IL team members. Product refinements ongoing through Scout Q4 2026 deployment. Platform is already live at medsync.vet.</w:t>
             </w:r>
           </w:p>
         </w:tc>
@@ -38987,7 +38995,7 @@
                 <w:sz w:val="18"/>
                 <w:szCs w:val="18"/>
               </w:rPr>
-              <w:t xml:space="preserve">Q1 2029</w:t>
+              <w:t xml:space="preserve">Q1 2028</w:t>
             </w:r>
           </w:p>
         </w:tc>
@@ -39073,7 +39081,7 @@
                 <w:sz w:val="20"/>
                 <w:szCs w:val="20"/>
               </w:rPr>
-              <w:t xml:space="preserve">End of 2027 milestone: Full platform built, designed, and alpha-ready. Four Scout Inventory Leads have seen and tested the product internally. Every feature in this document is functional and validated against Scout data before a single patient appointment depends on it.</w:t>
+              <w:t xml:space="preserve">End of Q4 2027 milestone: Scout live, platform refined, designed, and alpha-ready. Four Scout Inventory Leads have seen and tested the product internally. Every feature in this document is functional and validated against Scout data before a single patient appointment depends on it.</w:t>
             </w:r>
           </w:p>
         </w:tc>
@@ -39100,7 +39108,7 @@
           <w:sz w:val="23"/>
           <w:szCs w:val="23"/>
         </w:rPr>
-        <w:t xml:space="preserve">2028 — Scout pilot and clinical validation:</w:t>
+        <w:t xml:space="preserve">Q4 2026 – 2027 — Scout deployment and clinical validation:</w:t>
       </w:r>
     </w:p>
     <w:p>
@@ -39114,7 +39122,7 @@
           <w:sz w:val="20"/>
           <w:szCs w:val="20"/>
         </w:rPr>
-        <w:t xml:space="preserve">All of 2028 is dedicated to running MedSync live across all four existing Scout locations and any denovo Scout locations that open during the year. No external customers. No marketing. This is the year MedSync earns the right to go to market — by proving it works in the most demanding possible environment: a real multi-site veterinary urgent care group with real patients, real clinical staff, and real financial accountability.</w:t>
+        <w:t xml:space="preserve">Beginning Q4 2026, MedSync goes live across all four existing Scout locations and any denovo Scout locations that open during the year. No external customers. No marketing. This is the year MedSync earns the right to go to market — by proving it works in the most demanding possible environment: a real multi-site veterinary urgent care group with real patients, real clinical staff, and real financial accountability.</w:t>
       </w:r>
     </w:p>
     <w:p>
@@ -39169,7 +39177,7 @@
                 <w:sz w:val="18"/>
                 <w:szCs w:val="18"/>
               </w:rPr>
-              <w:t xml:space="preserve">H1 2028</w:t>
+              <w:t xml:space="preserve">H1 2027</w:t>
             </w:r>
           </w:p>
         </w:tc>
@@ -39231,7 +39239,7 @@
                 <w:sz w:val="18"/>
                 <w:szCs w:val="18"/>
               </w:rPr>
-              <w:t xml:space="preserve">H2 2028</w:t>
+              <w:t xml:space="preserve">H2 2027</w:t>
             </w:r>
           </w:p>
         </w:tc>
@@ -39287,7 +39295,7 @@
           <w:sz w:val="20"/>
           <w:szCs w:val="20"/>
         </w:rPr>
-        <w:t xml:space="preserve">What the 2028 Scout pilot proves — documented and measurable:</w:t>
+        <w:t xml:space="preserve">What the 2027 Scout validation proves — documented and measurable:</w:t>
       </w:r>
     </w:p>
     <w:p>
@@ -39521,7 +39529,7 @@
                 <w:sz w:val="20"/>
                 <w:szCs w:val="20"/>
               </w:rPr>
-              <w:t xml:space="preserve">End of 2028 milestone: MedSync has operated live in a multi-site veterinary urgent care group for a full year. The ROI is documented. The product is refined. The Inventory Leads trust it. The Admin can speak to it. The platform is ready for the external market — and it arrives with receipts.</w:t>
+              <w:t xml:space="preserve">End of 2027 milestone: MedSync has operated live in a multi-site veterinary urgent care group for a full year. The ROI is documented. The product is refined. The Inventory Leads trust it. The Admin can speak to it. The platform is ready for the external market — and it arrives with receipts.</w:t>
             </w:r>
           </w:p>
         </w:tc>
@@ -39548,7 +39556,7 @@
           <w:sz w:val="23"/>
           <w:szCs w:val="23"/>
         </w:rPr>
-        <w:t xml:space="preserve">2029 — External market launch:</w:t>
+        <w:t xml:space="preserve">2028 — External market launch:</w:t>
       </w:r>
     </w:p>
     <w:p>
@@ -39562,7 +39570,7 @@
           <w:sz w:val="20"/>
           <w:szCs w:val="20"/>
         </w:rPr>
-        <w:t xml:space="preserve">MedSync enters the external market in 2029 not as a new product looking for its first customer — but as a proven platform with a year of documented results, a refined user experience, and a reference customer whose CEO can speak to the product directly.</w:t>
+        <w:t xml:space="preserve">MedSync enters the external market in 2028 not as a new product looking for its first customer — but as a proven platform with a year of documented results, a refined user experience, and a reference customer whose CEO can speak to the product directly.</w:t>
       </w:r>
     </w:p>
     <w:p>
@@ -40059,7 +40067,7 @@
           <w:sz w:val="20"/>
           <w:szCs w:val="20"/>
         </w:rPr>
-        <w:t xml:space="preserve">With dedicated payroll of $350K–$470K and a realistic blended average of $259/month per customer across the tiered pricing model, MedSync reaches payroll break-even at approximately 130–135 customers. At the right customer acquisition pace, that is achievable by mid-2030 — 18 months from the 2029 external launch. Here are the five strategies that determine whether that timeline holds.</w:t>
+        <w:t xml:space="preserve">With dedicated payroll of $350K–$470K and a realistic blended average of $259/month per customer across the tiered pricing model, MedSync reaches payroll break-even at approximately 130–135 customers. At the right customer acquisition pace, that is achievable by mid-2029 — 18 months from the 2028 external launch. Here are the five strategies that determine whether that timeline holds.</w:t>
       </w:r>
     </w:p>
     <w:p>
@@ -40143,7 +40151,7 @@
                 <w:sz w:val="19"/>
                 <w:szCs w:val="19"/>
               </w:rPr>
-              <w:t xml:space="preserve">By launch day in 2029, MedSync has a full year of Scout data: real COGs improvement numbers, real procurement savings, real expiration waste eliminated. One compelling case study published in a veterinary trade publication or presented at VMX or NAVC can generate 20–30 qualified leads in a single week. A peer reference from a respected multi-site group closes deals that no sales pitch can close alone. The quality of that case study is the single most important commercial variable in year one.</w:t>
+              <w:t xml:space="preserve">By launch day in 2028, MedSync has a full year of Scout data: real COGs improvement numbers, real procurement savings, real expiration waste eliminated. One compelling case study published in a veterinary trade publication or presented at VMX or NAVC can generate 20–30 qualified leads in a single week. A peer reference from a respected multi-site group closes deals that no sales pitch can close alone. The quality of that case study is the single most important commercial variable in year one.</w:t>
             </w:r>
           </w:p>
         </w:tc>
@@ -40609,7 +40617,7 @@
                 <w:sz w:val="17"/>
                 <w:szCs w:val="17"/>
               </w:rPr>
-              <w:t xml:space="preserve">Q1 2029</w:t>
+              <w:t xml:space="preserve">Q1 2028</w:t>
             </w:r>
           </w:p>
         </w:tc>
@@ -40764,7 +40772,7 @@
                 <w:sz w:val="17"/>
                 <w:szCs w:val="17"/>
               </w:rPr>
-              <w:t xml:space="preserve">Q2 2029</w:t>
+              <w:t xml:space="preserve">Q2 2028</w:t>
             </w:r>
           </w:p>
         </w:tc>
@@ -40919,7 +40927,7 @@
                 <w:sz w:val="17"/>
                 <w:szCs w:val="17"/>
               </w:rPr>
-              <w:t xml:space="preserve">Q3 2029</w:t>
+              <w:t xml:space="preserve">Q3 2028</w:t>
             </w:r>
           </w:p>
         </w:tc>
@@ -41074,7 +41082,7 @@
                 <w:sz w:val="17"/>
                 <w:szCs w:val="17"/>
               </w:rPr>
-              <w:t xml:space="preserve">Q4 2029</w:t>
+              <w:t xml:space="preserve">Q4 2028</w:t>
             </w:r>
           </w:p>
         </w:tc>
@@ -41229,7 +41237,7 @@
                 <w:sz w:val="17"/>
                 <w:szCs w:val="17"/>
               </w:rPr>
-              <w:t xml:space="preserve">Q1 2030</w:t>
+              <w:t xml:space="preserve">Q1 2029</w:t>
             </w:r>
           </w:p>
         </w:tc>
@@ -41258,7 +41266,7 @@
                 <w:sz w:val="16"/>
                 <w:szCs w:val="16"/>
               </w:rPr>
-              <w:t xml:space="preserve">Second year of Scout case study. Testimonials from 2029 customers. Third PE deal.</w:t>
+              <w:t xml:space="preserve">Second year of Scout case study. Testimonials from 2028 customers. Third PE deal.</w:t>
             </w:r>
           </w:p>
         </w:tc>
@@ -41384,7 +41392,7 @@
                 <w:sz w:val="17"/>
                 <w:szCs w:val="17"/>
               </w:rPr>
-              <w:t xml:space="preserve">Q2 2030</w:t>
+              <w:t xml:space="preserve">Q2 2029</w:t>
             </w:r>
           </w:p>
         </w:tc>
@@ -41539,7 +41547,7 @@
                 <w:sz w:val="17"/>
                 <w:szCs w:val="17"/>
               </w:rPr>
-              <w:t xml:space="preserve">Q3–Q4 2030</w:t>
+              <w:t xml:space="preserve">Q3–Q4 2029</w:t>
             </w:r>
           </w:p>
         </w:tc>
@@ -41718,7 +41726,7 @@
                 <w:sz w:val="20"/>
                 <w:szCs w:val="20"/>
               </w:rPr>
-              <w:t xml:space="preserve">The single most important commercial decision MedSync makes in 2029 is which customers to pursue first. Vetspire-native groups of 4–8 locations, actively growing, with a dedicated Inventory Lead or practice manager — that profile closes faster, retains longer, and generates more revenue per customer than any other segment. Find 10 of those in Q1. Everything else follows.</w:t>
+              <w:t xml:space="preserve">The single most important commercial decision MedSync makes in 2028 is which customers to pursue first. Vetspire-native groups of 4–8 locations, actively growing, with a dedicated Inventory Lead or practice manager — that profile closes faster, retains longer, and generates more revenue per customer than any other segment. Find 10 of those in Q1. Everything else follows.</w:t>
             </w:r>
           </w:p>
         </w:tc>
@@ -42426,7 +42434,7 @@
                 <w:sz w:val="17"/>
                 <w:szCs w:val="17"/>
               </w:rPr>
-              <w:t xml:space="preserve">Jan–Dec 2028</w:t>
+              <w:t xml:space="preserve">Jan–Dec 2027</w:t>
             </w:r>
           </w:p>
         </w:tc>
@@ -42678,7 +42686,7 @@
                 <w:sz w:val="19"/>
                 <w:szCs w:val="19"/>
               </w:rPr>
-              <w:t xml:space="preserve">No native app until 2029</w:t>
+              <w:t xml:space="preserve">No native app until 2028</w:t>
             </w:r>
           </w:p>
         </w:tc>
@@ -43720,7 +43728,7 @@
                 <w:sz w:val="17"/>
                 <w:szCs w:val="17"/>
               </w:rPr>
-              <w:t xml:space="preserve">$0  (2029 only)</w:t>
+              <w:t xml:space="preserve">$0  (2028 only)</w:t>
             </w:r>
           </w:p>
         </w:tc>

</xml_diff>